<commit_message>
Accumulate retrospective evidence and refresh Word report
</commit_message>
<xml_diff>
--- a/stuff/FUTURE_IDEAS_WHAT_HAPPENED.docx
+++ b/stuff/FUTURE_IDEAS_WHAT_HAPPENED.docx
@@ -70,6 +70,14 @@
     <w:p>
       <w:r>
         <w:t>Basis: No directional evidence (placeholder). Signal matches do not establish facts; open the underlying sources before trusting this score.</w:t>
+      </w:r>
+    </w:p>
+    <w:p>
+      <w:r>
+        <w:rPr>
+          <w:sz w:val="16"/>
+        </w:rPr>
+        <w:t>Latest source: https://news.google.com/rss/articles/CBMi2AFBVV95cUxNdGlTVU4zMkVqbk03bEVYXzJKc3hJTndLVWZjdFl0ZUFCTHg2cEgtYWNlWlRIOWgyUGRqME00b3Q4NThmREJkR0RsUURLQlpDbC1lQUxxTmVqSGlpTGd4VXB3Xy12bGtoX2FFdUI1aThGbm1Od0FpaGFIZ0tqbnlsTlF2SUZqZVJoVWM4dldsZW4xRm1ISWxzU2xBVTZjN2dmNjNBZzhXR24xNTNVRXNsejhmaWhYcXBqUFcxM2JtQWJreGtxRHUxTFA0cHFld3NPVHYwMXVzNXE?oc=5</w:t>
       </w:r>
     </w:p>
     <w:p>

</xml_diff>